<commit_message>
Align the cooling tower Lua model and documents with the workbook
- Variables referenced to "EPFL IPESE research group" are referenced
  to Daniel Florez-Orrego, in the workbook and both JSON files.
- CoolingTower_ET.lua: supply 16.32 °C and return 30 °C (were 12 and
  14 °C), air at 20 °C and 40 % as inputs, Twetbulb computed with the
  Stull formula and rounded as in the workbook (it was fixed at 12.17),
  water flow from cp_water and the range instead of deltaH, version
  1.0.2, and the workbook's references. It gives the workbook's values:
  approach 4 K, investment 4,605,387 EUR.
- CoolingTower_from_lua.json follows: same values, bounds, names,
  descriptions and references, H2O composition, Tdrybulb an input.
- Cooling_Tower_Model_Documentation.docx: parameter and result tables
  with the workbook's values (cp_water instead of deltaH), and the Lua
  code section as implemented.

Co-Authored-By: Claude Opus 5.5 <noreply@anthropic.com>
</commit_message>
<xml_diff>
--- a/1-EnergyTechnologies/CoolingTower/Documents/Cooling_Tower_Model_Documentation.docx
+++ b/1-EnergyTechnologies/CoolingTower/Documents/Cooling_Tower_Model_Documentation.docx
@@ -830,7 +830,7 @@
                 <w:sz w:val="20"/>
                 <w:szCs w:val="20"/>
               </w:rPr>
-              <w:t xml:space="preserve">13</w:t>
+              <w:t xml:space="preserve">16.32</w:t>
             </w:r>
           </w:p>
         </w:tc>
@@ -896,7 +896,7 @@
                 <w:sz w:val="20"/>
                 <w:szCs w:val="20"/>
               </w:rPr>
-              <w:t xml:space="preserve">Supply temperature (updated from 12°C to ensure approach &gt; 0)</w:t>
+              <w:t xml:space="preserve">Supply temperature, set 4 K above the wet-bulb temperature</w:t>
             </w:r>
           </w:p>
         </w:tc>
@@ -966,7 +966,7 @@
                 <w:sz w:val="20"/>
                 <w:szCs w:val="20"/>
               </w:rPr>
-              <w:t xml:space="preserve">14</w:t>
+              <w:t xml:space="preserve">30</w:t>
             </w:r>
           </w:p>
         </w:tc>
@@ -1034,7 +1034,7 @@
                 <w:sz w:val="20"/>
                 <w:szCs w:val="20"/>
               </w:rPr>
-              <w:t xml:space="preserve">Return temperature (original Florez-Orrego / ECOS2105: 40°C)</w:t>
+              <w:t xml:space="preserve">Return temperature (ECOS2015, Florez-Orrego, et al.)</w:t>
             </w:r>
           </w:p>
         </w:tc>
@@ -1204,7 +1204,7 @@
                 <w:sz w:val="20"/>
                 <w:szCs w:val="20"/>
               </w:rPr>
-              <w:t xml:space="preserve">deltaH</w:t>
+              <w:t xml:space="preserve">cp_water</w:t>
             </w:r>
           </w:p>
         </w:tc>
@@ -1238,7 +1238,7 @@
                 <w:sz w:val="20"/>
                 <w:szCs w:val="20"/>
               </w:rPr>
-              <w:t xml:space="preserve">62.8</w:t>
+              <w:t xml:space="preserve">4.2</w:t>
             </w:r>
           </w:p>
         </w:tc>
@@ -1272,7 +1272,7 @@
                 <w:sz w:val="20"/>
                 <w:szCs w:val="20"/>
               </w:rPr>
-              <w:t xml:space="preserve">kJ/kg</w:t>
+              <w:t xml:space="preserve">kJ/kgK</w:t>
             </w:r>
           </w:p>
         </w:tc>
@@ -1306,7 +1306,7 @@
                 <w:sz w:val="20"/>
                 <w:szCs w:val="20"/>
               </w:rPr>
-              <w:t xml:space="preserve">Enthalpy change of cooling water @ 1 bar, 15 → 30°C</w:t>
+              <w:t xml:space="preserve">Heat capacity of water at 25 °C</w:t>
             </w:r>
           </w:p>
         </w:tc>
@@ -1473,7 +1473,7 @@
                 <w:sz w:val="20"/>
                 <w:szCs w:val="20"/>
               </w:rPr>
-              <w:t xml:space="preserve">Dry-bulb temperature (site-specific)</w:t>
+              <w:t xml:space="preserve">Dry-bulb temperature of the ambient air at the site, at design conditions</w:t>
             </w:r>
           </w:p>
         </w:tc>
@@ -1611,7 +1611,7 @@
                 <w:sz w:val="20"/>
                 <w:szCs w:val="20"/>
               </w:rPr>
-              <w:t xml:space="preserve">Relative humidity (site-specific)</w:t>
+              <w:t xml:space="preserve">Relative humidity of the ambient air at the site, at design conditions</w:t>
             </w:r>
           </w:p>
         </w:tc>
@@ -1679,7 +1679,7 @@
                 <w:sz w:val="20"/>
                 <w:szCs w:val="20"/>
               </w:rPr>
-              <w:t xml:space="preserve">12.17</w:t>
+              <w:t xml:space="preserve">12.32</w:t>
             </w:r>
           </w:p>
         </w:tc>
@@ -1745,7 +1745,7 @@
                 <w:sz w:val="20"/>
                 <w:szCs w:val="20"/>
               </w:rPr>
-              <w:t xml:space="preserve">Wet-bulb temperature (computed from Stull formula, consistent with 20°C / 40% RH)</w:t>
+              <w:t xml:space="preserve">Wet-bulb temperature, calculated from Tdrybulb and RelatHum with the formula of Stull (2011), rounded to 0.01 °C</w:t>
             </w:r>
           </w:p>
         </w:tc>
@@ -3303,40 +3303,40 @@
                 <w:sz w:val="20"/>
                 <w:szCs w:val="20"/>
               </w:rPr>
-              <w:t xml:space="preserve">1</w:t>
-            </w:r>
-          </w:p>
-        </w:tc>
-        <w:tc>
-          <w:tcPr>
-            <w:tcW w:type="dxa" w:w="2340"/>
-            <w:tcBorders>
-              <w:top w:val="single" w:color="CCCCCC" w:sz="1"/>
-              <w:left w:val="single" w:color="CCCCCC" w:sz="1"/>
-              <w:bottom w:val="single" w:color="CCCCCC" w:sz="1"/>
-              <w:right w:val="single" w:color="CCCCCC" w:sz="1"/>
-            </w:tcBorders>
-            <w:tcMar>
-              <w:top w:type="dxa" w:w="80"/>
-              <w:left w:type="dxa" w:w="120"/>
-              <w:bottom w:type="dxa" w:w="80"/>
-              <w:right w:type="dxa" w:w="120"/>
-            </w:tcMar>
-          </w:tcPr>
-          <w:p>
-            <w:pPr>
-              <w:jc w:val="left"/>
-            </w:pPr>
-            <w:r>
-              <w:rPr>
-                <w:rFonts w:ascii="Arial" w:cs="Arial" w:eastAsia="Arial" w:hAnsi="Arial"/>
-                <w:b w:val="false"/>
-                <w:bCs w:val="false"/>
-                <w:color w:val="000000"/>
-                <w:sz w:val="20"/>
-                <w:szCs w:val="20"/>
-              </w:rPr>
-              <w:t xml:space="preserve">Very small (typical: 5.5–8.3 K)</w:t>
+              <w:t xml:space="preserve">13.68</w:t>
+            </w:r>
+          </w:p>
+        </w:tc>
+        <w:tc>
+          <w:tcPr>
+            <w:tcW w:type="dxa" w:w="2340"/>
+            <w:tcBorders>
+              <w:top w:val="single" w:color="CCCCCC" w:sz="1"/>
+              <w:left w:val="single" w:color="CCCCCC" w:sz="1"/>
+              <w:bottom w:val="single" w:color="CCCCCC" w:sz="1"/>
+              <w:right w:val="single" w:color="CCCCCC" w:sz="1"/>
+            </w:tcBorders>
+            <w:tcMar>
+              <w:top w:type="dxa" w:w="80"/>
+              <w:left w:type="dxa" w:w="120"/>
+              <w:bottom w:type="dxa" w:w="80"/>
+              <w:right w:type="dxa" w:w="120"/>
+            </w:tcMar>
+          </w:tcPr>
+          <w:p>
+            <w:pPr>
+              <w:jc w:val="left"/>
+            </w:pPr>
+            <w:r>
+              <w:rPr>
+                <w:rFonts w:ascii="Arial" w:cs="Arial" w:eastAsia="Arial" w:hAnsi="Arial"/>
+                <w:b w:val="false"/>
+                <w:bCs w:val="false"/>
+                <w:color w:val="000000"/>
+                <w:sz w:val="20"/>
+                <w:szCs w:val="20"/>
+              </w:rPr>
+              <w:t xml:space="preserve">Within 5–15 K (typical industrial towers)</w:t>
             </w:r>
           </w:p>
         </w:tc>
@@ -3474,7 +3474,7 @@
                 <w:sz w:val="20"/>
                 <w:szCs w:val="20"/>
               </w:rPr>
-              <w:t xml:space="preserve">0.83</w:t>
+              <w:t xml:space="preserve">4.00</w:t>
             </w:r>
           </w:p>
         </w:tc>
@@ -3508,7 +3508,7 @@
                 <w:sz w:val="20"/>
                 <w:szCs w:val="20"/>
               </w:rPr>
-              <w:t xml:space="preserve">Now positive (typical: 3.3–6.7 K)</w:t>
+              <w:t xml:space="preserve">Within the typical 3.3–6.7 K</w:t>
             </w:r>
           </w:p>
         </w:tc>
@@ -3776,7 +3776,7 @@
                 <w:sz w:val="20"/>
                 <w:szCs w:val="20"/>
               </w:rPr>
-              <w:t xml:space="preserve">Cool_Qmax / deltaH × 3600 / 1000</w:t>
+              <w:t xml:space="preserve">Cool_Qmax / (cp_water × range) × 3600 / 1000</w:t>
             </w:r>
           </w:p>
         </w:tc>
@@ -3842,7 +3842,7 @@
                 <w:sz w:val="20"/>
                 <w:szCs w:val="20"/>
               </w:rPr>
-              <w:t xml:space="preserve">5,732</w:t>
+              <w:t xml:space="preserve">6,266</w:t>
             </w:r>
           </w:p>
         </w:tc>
@@ -4013,7 +4013,7 @@
                 <w:sz w:val="20"/>
                 <w:szCs w:val="20"/>
               </w:rPr>
-              <w:t xml:space="preserve">5,732</w:t>
+              <w:t xml:space="preserve">6,266</w:t>
             </w:r>
           </w:p>
         </w:tc>
@@ -4181,7 +4181,7 @@
                 <w:sz w:val="20"/>
                 <w:szCs w:val="20"/>
               </w:rPr>
-              <w:t xml:space="preserve">8.8</w:t>
+              <w:t xml:space="preserve">131.1</w:t>
             </w:r>
           </w:p>
         </w:tc>
@@ -4552,7 +4552,7 @@
                 <w:sz w:val="20"/>
                 <w:szCs w:val="20"/>
               </w:rPr>
-              <w:t xml:space="preserve">Computed</w:t>
+              <w:t xml:space="preserve">4,605,387</w:t>
             </w:r>
           </w:p>
         </w:tc>
@@ -4720,7 +4720,7 @@
                 <w:sz w:val="20"/>
                 <w:szCs w:val="20"/>
               </w:rPr>
-              <w:t xml:space="preserve">Computed</w:t>
+              <w:t xml:space="preserve">317,146</w:t>
             </w:r>
           </w:p>
         </w:tc>
@@ -4780,7 +4780,7 @@
         <w:pStyle w:val="Heading3"/>
       </w:pPr>
       <w:r>
-        <w:t xml:space="preserve">5.1 Proposed Lua Code for Wet-Bulb Temperature</w:t>
+        <w:t xml:space="preserve">5.1 Lua Code for the Wet-Bulb Temperature</w:t>
       </w:r>
     </w:p>
     <w:p>
@@ -4788,7 +4788,7 @@
         <w:spacing w:after="120"/>
       </w:pPr>
       <w:r>
-        <w:t xml:space="preserve">Replace the hardcoded Twetbulb parameter with a calculated value:</w:t>
+        <w:t xml:space="preserve">The Lua model computes Twetbulb from the dry-bulb temperature and the relative humidity, rounded to 0.01 °C as in the workbook:</w:t>
       </w:r>
     </w:p>
     <w:p>
@@ -4801,7 +4801,7 @@
           <w:sz w:val="18"/>
           <w:szCs w:val="18"/>
         </w:rPr>
-        <w:t xml:space="preserve">Twetbulb = {job = 'Tdrybulb * math.atan(0.151977 * math.sqrt(RelatHum + 8.313659)) + math.atan(Tdrybulb + RelatHum) - math.atan(RelatHum - 1.676331) + 0.00391838 * RelatHum^1.5 * math.atan(0.023101 * RelatHum) - 4.686035', unit = 'C'},</w:t>
+        <w:t xml:space="preserve">Twetbulb = {job='math.floor((Tdrybulb*math.atan(0.151977*math.sqrt(RelatHum+8.313659)) + math.atan(Tdrybulb+RelatHum) - math.atan(RelatHum-1.676331) + 0.00391838*RelatHum^1.5*math.atan(0.023101*RelatHum) - 4.686035)*100 + 0.5)/100', unit='C'},</w:t>
       </w:r>
     </w:p>
     <w:p>
@@ -4809,7 +4809,7 @@
         <w:spacing w:after="240"/>
       </w:pPr>
       <w:r>
-        <w:t xml:space="preserve">This ensures that if Tdrybulb or RelatHum changes for different site conditions, Twetbulb — and therefore approach — will update automatically.</w:t>
+        <w:t xml:space="preserve">If Tdrybulb or RelatHum change for different site conditions, Twetbulb — and therefore approach — update automatically. Twetbulb is an output of the model, so the other jobs refer to it as Twetbulb(), for instance approach = Cool_Tin - Twetbulb().</w:t>
       </w:r>
     </w:p>
     <w:p>

</xml_diff>